<commit_message>
fix(cartas): quitar referencias al Código del Trabajo en la carta de aviso de término
- lib/carta-aviso.ts: causales descritas en palabras (sin "artículo N° … del
  Código del Trabajo"); avisos de 30 días, carta certificada y cotizaciones sin
  cita normativa. "invocando como causal {CAUSAL_TEXTO}".
- Plantilla CARTA Aviso Termino.docx: quitado subtítulo "(Artículo 162 …)" y las
  referencias a los Art. 162 y 177.
- CLAUDE.md: regla — los documentos tipo no citan el Código del Trabajo.

Co-Authored-By: Claude Opus 4.8 <noreply@anthropic.com>
</commit_message>
<xml_diff>
--- a/app/plantillas/GENERICO/CARTA Aviso Termino.docx
+++ b/app/plantillas/GENERICO/CARTA Aviso Termino.docx
@@ -18,14 +18,6 @@
     </w:p>
     <w:p>
       <w:pPr>
-        <w:jc w:val="center"/>
-      </w:pPr>
-      <w:r>
-        <w:t xml:space="preserve">(Artículo 162 del Código del Trabajo)</w:t>
-      </w:r>
-    </w:p>
-    <w:p>
-      <w:pPr>
         <w:jc w:val="both"/>
       </w:pPr>
     </w:p>
@@ -110,7 +102,7 @@
         <w:jc w:val="both"/>
       </w:pPr>
       <w:r>
-        <w:t xml:space="preserve">Por medio de la presente, {RAZON_SOCIAL}, RUT {RUT_EMPRESA}, representada por don(ña) {NOMBRE_REP_LEGAL}, comunica a usted que se ha resuelto poner término a su contrato de trabajo, cuya relación laboral se inició con fecha {FECHA_INGRESO}, a contar del día {FECHA_TERMINO}, invocando la causal contemplada en {CAUSAL_TEXTO}.</w:t>
+        <w:t xml:space="preserve">Por medio de la presente, {RAZON_SOCIAL}, RUT {RUT_EMPRESA}, representada por don(ña) {NOMBRE_REP_LEGAL}, comunica a usted que se ha resuelto poner término a su contrato de trabajo, cuya relación laboral se inició con fecha {FECHA_INGRESO}, a contar del día {FECHA_TERMINO}, invocando como causal {CAUSAL_TEXTO}.</w:t>
       </w:r>
     </w:p>
     <w:p>
@@ -142,7 +134,7 @@
         <w:jc w:val="both"/>
       </w:pPr>
       <w:r>
-        <w:t xml:space="preserve">Conforme a lo dispuesto en el artículo 162 del Código del Trabajo, se informa a usted que los montos que se pagarán con ocasión del término de su contrato, sin perjuicio de su liquidación definitiva en el respectivo finiquito, son los siguientes:</w:t>
+        <w:t xml:space="preserve">Se informa a usted que los montos que se pagarán con ocasión del término de su contrato, sin perjuicio de su liquidación definitiva en el respectivo finiquito, son los siguientes:</w:t>
       </w:r>
     </w:p>
     <w:p>
@@ -204,7 +196,7 @@
         <w:jc w:val="both"/>
       </w:pPr>
       <w:r>
-        <w:t xml:space="preserve">El finiquito correspondiente será puesto a su disposición, para su revisión, firma y pago, dentro del plazo de diez días hábiles contado desde la separación, conforme al artículo 177 del Código del Trabajo, en las oficinas de la empresa o ante el ministro de fe que se le indicará.</w:t>
+        <w:t xml:space="preserve">El finiquito correspondiente será puesto a su disposición, para su revisión, firma y pago, dentro del plazo de diez días hábiles contado desde la separación, en las oficinas de la empresa o ante el ministro de fe que se le indicará.</w:t>
       </w:r>
     </w:p>
     <w:p>

</xml_diff>

<commit_message>
Carta de aviso de término: ajustes por causal
En causales del Art. 159 (vencimiento del plazo, conclusión de obra, caso
fortuito) la carta ya no incluye el párrafo de aviso previo / indemnización
sustitutiva —solo aplica a 161 y 163 bis— ni la sección "Los hechos en que se
funda la causal…". La sección de hechos queda condicional ({#mostrarHechos},
visible solo en 160/161/163bis) en la plantilla CARTA Aviso Termino.docx, y la
lógica vive en carta-aviso.ts (conIndemnizacion / mostrarHechos).

Co-Authored-By: Claude Opus 4.8 <noreply@anthropic.com>
</commit_message>
<xml_diff>
--- a/app/plantillas/GENERICO/CARTA Aviso Termino.docx
+++ b/app/plantillas/GENERICO/CARTA Aviso Termino.docx
@@ -110,15 +110,15 @@
         <w:jc w:val="both"/>
       </w:pPr>
       <w:r>
-        <w:t xml:space="preserve">Los hechos en que se funda la causal invocada son los siguientes:</w:t>
-      </w:r>
-    </w:p>
-    <w:p>
-      <w:pPr>
-        <w:jc w:val="both"/>
-      </w:pPr>
-      <w:r>
-        <w:t xml:space="preserve">{HECHOS_TEXTO}</w:t>
+        <w:t xml:space="preserve">{#mostrarHechos}Los hechos en que se funda la causal invocada son los siguientes:</w:t>
+      </w:r>
+    </w:p>
+    <w:p>
+      <w:pPr>
+        <w:jc w:val="both"/>
+      </w:pPr>
+      <w:r>
+        <w:t xml:space="preserve">{HECHOS_TEXTO}{/mostrarHechos}</w:t>
       </w:r>
     </w:p>
     <w:p>

</xml_diff>